<commit_message>
Document the Vercel project the team uses to run the draft.
The public address is eon-reality-website.vercel.app. The handover now says how to publish a change, and tells the team to leave the Field IQ walkthrough project alone.

Co-authored-by: DanLejerskar <DanLejerskar@users.noreply.github.com>
</commit_message>
<xml_diff>
--- a/eon-product-overview/COVER-EMAIL.docx
+++ b/eon-product-overview/COVER-EMAIL.docx
@@ -4,7 +4,7 @@
   <w:body>
     <w:p>
       <w:pPr>
-        <w:pStyle w:val="Heading1"/>
+        <w:pStyle w:val="Title"/>
       </w:pPr>
       <w:r>
         <w:t>Cover email</w:t>
@@ -42,11 +42,6 @@
     </w:p>
     <w:p>
       <w:r>
-        <w:t>---</w:t>
-      </w:r>
-    </w:p>
-    <w:p>
-      <w:r>
         <w:t>Raul and the team,</w:t>
       </w:r>
     </w:p>
@@ -71,18 +66,27 @@
       </w:r>
     </w:p>
     <w:p>
+      <w:pPr>
+        <w:pStyle w:val="ListNumber"/>
+      </w:pPr>
       <w:r>
-        <w:t>1. eon-product-overview/HANDOVER.md</w:t>
+        <w:t>eon-product-overview/HANDOVER.md</w:t>
       </w:r>
     </w:p>
     <w:p>
+      <w:pPr>
+        <w:pStyle w:val="ListNumber"/>
+      </w:pPr>
       <w:r>
-        <w:t>2. eon-product-overview/COVER-EMAIL.md</w:t>
+        <w:t>eon-product-overview/COVER-EMAIL.md</w:t>
       </w:r>
     </w:p>
     <w:p>
+      <w:pPr>
+        <w:pStyle w:val="ListNumber"/>
+      </w:pPr>
       <w:r>
-        <w:t>3. eon-product-overview/site/build.py</w:t>
+        <w:t>eon-product-overview/site/build.py</w:t>
       </w:r>
     </w:p>
     <w:p>
@@ -92,22 +96,47 @@
     </w:p>
     <w:p>
       <w:r>
-        <w:t>Practice site, for reading in a browser:</w:t>
+        <w:t>The site to open:</w:t>
+      </w:r>
+    </w:p>
+    <w:p>
+      <w:r>
+        <w:t>https://eon-reality-website.vercel.app</w:t>
+      </w:r>
+    </w:p>
+    <w:p>
+      <w:r>
+        <w:t>Videos: https://eon-reality-website.vercel.app/site/videos.html</w:t>
+      </w:r>
+    </w:p>
+    <w:p>
+      <w:r>
+        <w:t>Prices: https://eon-reality-website.vercel.app/site/pricing.html</w:t>
+      </w:r>
+    </w:p>
+    <w:p>
+      <w:r>
+        <w:t>Vercel project: eon-reality-website</w:t>
+      </w:r>
+    </w:p>
+    <w:p>
+      <w:r>
+        <w:t>Dashboard: https://vercel.com/dans-projects-3b851cd9/eon-reality-website</w:t>
+      </w:r>
+    </w:p>
+    <w:p>
+      <w:r>
+        <w:t>That project is the only Vercel project for this draft. Do not deploy it onto https://field-iq-walkthrough.vercel.app. That address is the Field IQ walkthrough and it stays as it is.</w:t>
+      </w:r>
+    </w:p>
+    <w:p>
+      <w:r>
+        <w:t>If Vercel is down, the same pages are also here:</w:t>
       </w:r>
     </w:p>
     <w:p>
       <w:r>
         <w:t>https://htmlpreview.github.io/?https://raw.githubusercontent.com/DanLejerskar/field-iq-walkthrough/cursor/eon-product-overview-589c/eon-product-overview/site/index.html</w:t>
-      </w:r>
-    </w:p>
-    <w:p>
-      <w:r>
-        <w:t>Videos: change index.html to videos.html in that link.</w:t>
-      </w:r>
-    </w:p>
-    <w:p>
-      <w:r>
-        <w:t>Prices: change index.html to pricing.html.</w:t>
       </w:r>
     </w:p>
     <w:p>

</xml_diff>